<commit_message>
Relatório final do T1 em PDF e ajustes de consistência
- Adiciona o PDF final do relatório (compilado do .tex) e remove o PDF anterior
- Nome "Vítor Santana Feijó" com acento no relatório (.md, .docx, .tex), notebook e README
- Restaura no .tex a referência aos arquivos da base UCI (processed.cleveland.data e heart-disease.names)
- Título da capa: "Trabalho Final Aprendizado de Máquina - Parte 1"
- Alinha o item 11 do resumo dos prompts entre .md, .docx e .tex

Co-Authored-By: Claude Opus 5.5 (1M context) <noreply@anthropic.com>
</commit_message>
<xml_diff>
--- a/Relatório Trabalho Prático Final - Parte 1 (T1).docx
+++ b/Relatório Trabalho Prático Final - Parte 1 (T1).docx
@@ -218,7 +218,7 @@
                 <w:szCs w:val="22"/>
                 <w:rtl w:val="0"/>
               </w:rPr>
-              <w:t xml:space="preserve">Vitor Santana Feijó</w:t>
+              <w:t xml:space="preserve">Vítor Santana Feijó</w:t>
             </w:r>
           </w:p>
         </w:tc>
@@ -4491,7 +4491,7 @@
           <w:szCs w:val="22"/>
           <w:rtl w:val="0"/>
         </w:rPr>
-        <w:t xml:space="preserve">11. Verificar novamente a consistência dos arquivos; remover a página de orientações do template; padronizar o nome "Vitor" sem acento; registrar as alterações em commits.</w:t>
+        <w:t xml:space="preserve">11. Verificar novamente a consistência dos arquivos; remover a página de orientações do template; padronizar o nome "Vítor" com acento; registrar as alterações em commits.</w:t>
       </w:r>
     </w:p>
     <w:p>

</xml_diff>